<commit_message>
feat: add high-resolution 4.2 Entity-Relationship (E-R) Diagram image
</commit_message>
<xml_diff>
--- a/DRIVING_SCHOOL_MANAGEMENT_SYSTEM_PROJECT_REPORT.docx
+++ b/DRIVING_SCHOOL_MANAGEMENT_SYSTEM_PROJECT_REPORT.docx
@@ -11903,6 +11903,61 @@
           <w:sz w:val="32"/>
         </w:rPr>
         <w:t>4.2 Entity-Relationship (E-R) Diagram</w:t>
+      </w:r>
+    </w:p>
+    <w:p>
+      <w:pPr>
+        <w:spacing w:before="160" w:after="160"/>
+        <w:jc w:val="center"/>
+      </w:pPr>
+      <w:r>
+        <w:drawing>
+          <wp:inline xmlns:a="http://schemas.openxmlformats.org/drawingml/2006/main" xmlns:pic="http://schemas.openxmlformats.org/drawingml/2006/picture">
+            <wp:extent cx="6035040" cy="4437529"/>
+            <wp:docPr id="1" name="Picture 1"/>
+            <wp:cNvGraphicFramePr>
+              <a:graphicFrameLocks noChangeAspect="1"/>
+            </wp:cNvGraphicFramePr>
+            <a:graphic>
+              <a:graphicData uri="http://schemas.openxmlformats.org/drawingml/2006/picture">
+                <pic:pic>
+                  <pic:nvPicPr>
+                    <pic:cNvPr id="0" name="er_diagram.png"/>
+                    <pic:cNvPicPr/>
+                  </pic:nvPicPr>
+                  <pic:blipFill>
+                    <a:blip r:embed="rId9"/>
+                    <a:stretch>
+                      <a:fillRect/>
+                    </a:stretch>
+                  </pic:blipFill>
+                  <pic:spPr>
+                    <a:xfrm>
+                      <a:off x="0" y="0"/>
+                      <a:ext cx="6035040" cy="4437529"/>
+                    </a:xfrm>
+                    <a:prstGeom prst="rect"/>
+                  </pic:spPr>
+                </pic:pic>
+              </a:graphicData>
+            </a:graphic>
+          </wp:inline>
+        </w:drawing>
+      </w:r>
+    </w:p>
+    <w:p>
+      <w:pPr>
+        <w:spacing w:before="40" w:after="240" w:line="360" w:lineRule="auto"/>
+        <w:jc w:val="center"/>
+      </w:pPr>
+      <w:r>
+        <w:rPr>
+          <w:rFonts w:ascii="Times New Roman" w:hAnsi="Times New Roman"/>
+          <w:b w:val="0"/>
+          <w:i/>
+          <w:sz w:val="22"/>
+        </w:rPr>
+        <w:t>Figure 4.2: Entity-Relationship (E-R) Diagram for Driving School Management System</w:t>
       </w:r>
     </w:p>
     <w:p>

</xml_diff>

<commit_message>
feat: add high-resolution 4.3 Data Flow Diagram (First Level) image and embed in reports
</commit_message>
<xml_diff>
--- a/DRIVING_SCHOOL_MANAGEMENT_SYSTEM_PROJECT_REPORT.docx
+++ b/DRIVING_SCHOOL_MANAGEMENT_SYSTEM_PROJECT_REPORT.docx
@@ -12003,7 +12003,62 @@
           <w:color w:val="1F2937"/>
           <w:sz w:val="32"/>
         </w:rPr>
-        <w:t>4.3 Data Flow Diagrams (DFD)</w:t>
+        <w:t>4.3 Data Flow Diagram (First Level)</w:t>
+      </w:r>
+    </w:p>
+    <w:p>
+      <w:pPr>
+        <w:spacing w:before="160" w:after="160"/>
+        <w:jc w:val="center"/>
+      </w:pPr>
+      <w:r>
+        <w:drawing>
+          <wp:inline xmlns:a="http://schemas.openxmlformats.org/drawingml/2006/main" xmlns:pic="http://schemas.openxmlformats.org/drawingml/2006/picture">
+            <wp:extent cx="6035040" cy="4437529"/>
+            <wp:docPr id="2" name="Picture 2"/>
+            <wp:cNvGraphicFramePr>
+              <a:graphicFrameLocks noChangeAspect="1"/>
+            </wp:cNvGraphicFramePr>
+            <a:graphic>
+              <a:graphicData uri="http://schemas.openxmlformats.org/drawingml/2006/picture">
+                <pic:pic>
+                  <pic:nvPicPr>
+                    <pic:cNvPr id="0" name="dfd_level1_diagram.png"/>
+                    <pic:cNvPicPr/>
+                  </pic:nvPicPr>
+                  <pic:blipFill>
+                    <a:blip r:embed="rId10"/>
+                    <a:stretch>
+                      <a:fillRect/>
+                    </a:stretch>
+                  </pic:blipFill>
+                  <pic:spPr>
+                    <a:xfrm>
+                      <a:off x="0" y="0"/>
+                      <a:ext cx="6035040" cy="4437529"/>
+                    </a:xfrm>
+                    <a:prstGeom prst="rect"/>
+                  </pic:spPr>
+                </pic:pic>
+              </a:graphicData>
+            </a:graphic>
+          </wp:inline>
+        </w:drawing>
+      </w:r>
+    </w:p>
+    <w:p>
+      <w:pPr>
+        <w:spacing w:before="40" w:after="240" w:line="360" w:lineRule="auto"/>
+        <w:jc w:val="center"/>
+      </w:pPr>
+      <w:r>
+        <w:rPr>
+          <w:rFonts w:ascii="Times New Roman" w:hAnsi="Times New Roman"/>
+          <w:b w:val="0"/>
+          <w:i/>
+          <w:sz w:val="22"/>
+        </w:rPr>
+        <w:t>Figure 4.3: First Level Data Flow Diagram (Level 1 DFD) for Driving School Management System</w:t>
       </w:r>
     </w:p>
     <w:p>
@@ -12034,6 +12089,8 @@
         <w:t>• Process 4.0: Practical Attendance Logging (records kilometers and competency in AttendanceMaster).</w:t>
         <w:br/>
         <w:t>• Process 5.0: RTO Mock Quiz Assessment (evaluates question papers against answer keys and stores scores in TestScheduleMaster).</w:t>
+        <w:br/>
+        <w:t>• Process 6.0: Executive Analytics &amp; Excel Report Generation (reads D1, D3, D4, D7 to stream XLSX audit spreadsheets).</w:t>
         <w:br/>
         <w:br/>
         <w:t>C. Level 2 DFD (Slot Conflict Prevention Sub-System):</w:t>

</xml_diff>